<commit_message>
Make the DOCX a black-and-white formal edition with a title page
Add a conventional academic title page (עמוד שער) with placeholders for
the institution and author names, and switch the styling to monochrome
(black headings and rules, light-grey table header) for a thesis-style
formal look. 10 pages incl. the title page.

Co-Authored-By: Claude Opus 4.8 (1M context) <noreply@anthropic.com>
</commit_message>
<xml_diff>
--- a/reports/final_report_he.docx
+++ b/reports/final_report_he.docx
@@ -5,82 +5,168 @@
     <w:p>
       <w:pPr>
         <w:bidi/>
+        <w:spacing w:before="1400" w:after="120"/>
         <w:jc w:val="center"/>
       </w:pPr>
       <w:r>
         <w:rPr>
-          <w:rFonts w:ascii="Arial" w:hAnsi="Arial" w:cs="Arial"/>
+          <w:rFonts w:ascii="David" w:hAnsi="David" w:cs="David"/>
           <w:b w:val="0"/>
           <w:i w:val="0"/>
-          <w:color w:val="5A6B7D"/>
-          <w:sz w:val="18"/>
-          <w:szCs w:val="18"/>
-          <w:rtl w:val="1"/>
-        </w:rPr>
-        <w:t>פרויקט גמר · אלגוריתמים ברשתות</w:t>
+          <w:color w:val="333333"/>
+          <w:sz w:val="24"/>
+          <w:szCs w:val="24"/>
+          <w:rtl w:val="1"/>
+        </w:rPr>
+        <w:t>‹שם המוסד / הפקולטה›</w:t>
       </w:r>
     </w:p>
     <w:p>
       <w:pPr>
         <w:bidi/>
+        <w:spacing w:before="0" w:after="120"/>
         <w:jc w:val="center"/>
       </w:pPr>
       <w:r>
         <w:rPr>
-          <w:rFonts w:ascii="Arial" w:hAnsi="Arial" w:cs="Arial"/>
-          <w:b/>
-          <w:i w:val="0"/>
-          <w:color w:val="0D2740"/>
-          <w:sz w:val="44"/>
-          <w:szCs w:val="44"/>
-          <w:rtl w:val="1"/>
-        </w:rPr>
-        <w:t>תחנות קריטיות</w:t>
+          <w:rFonts w:ascii="David" w:hAnsi="David" w:cs="David"/>
+          <w:b w:val="0"/>
+          <w:i w:val="0"/>
+          <w:color w:val="333333"/>
+          <w:sz w:val="24"/>
+          <w:szCs w:val="24"/>
+          <w:rtl w:val="1"/>
+        </w:rPr>
+        <w:t>פרויקט גמר · הקורס: אלגוריתמים בגרפים</w:t>
       </w:r>
     </w:p>
     <w:p>
       <w:pPr>
         <w:bidi/>
+        <w:spacing w:before="1900" w:after="120"/>
         <w:jc w:val="center"/>
       </w:pPr>
       <w:r>
         <w:rPr>
           <w:rFonts w:ascii="David" w:hAnsi="David" w:cs="David"/>
-          <w:b w:val="0"/>
-          <w:i w:val="0"/>
-          <w:color w:val="33475B"/>
-          <w:sz w:val="24"/>
-          <w:szCs w:val="24"/>
-          <w:rtl w:val="1"/>
-        </w:rPr>
-        <w:t>ניתוח מרכזיות ועמידוּת ברשת התחבורה הציבורית בישראל כרשת מורכבת</w:t>
+          <w:b/>
+          <w:i w:val="0"/>
+          <w:color w:val="000000"/>
+          <w:sz w:val="60"/>
+          <w:szCs w:val="60"/>
+          <w:rtl w:val="1"/>
+        </w:rPr>
+        <w:t>תחנות קריטיות</w:t>
       </w:r>
     </w:p>
     <w:p>
       <w:pPr>
         <w:bidi/>
+        <w:spacing w:before="80" w:after="160"/>
         <w:jc w:val="center"/>
       </w:pPr>
       <w:r>
         <w:rPr>
-          <w:rFonts w:ascii="Arial" w:hAnsi="Arial" w:cs="Arial"/>
+          <w:rFonts w:ascii="David" w:hAnsi="David" w:cs="David"/>
           <w:b w:val="0"/>
           <w:i w:val="0"/>
-          <w:color w:val="5A6B7D"/>
-          <w:sz w:val="18"/>
-          <w:szCs w:val="18"/>
-          <w:rtl w:val="1"/>
-        </w:rPr>
-        <w:t>קורס: אלגוריתמים בגרפים · מנחה: ד"ר אבנר פריאל · נתונים: GTFS משרד התחבורה (אפריל 2026) · יולי 2026</w:t>
+          <w:color w:val="000000"/>
+          <w:sz w:val="28"/>
+          <w:szCs w:val="28"/>
+          <w:rtl w:val="1"/>
+        </w:rPr>
+        <w:t>ניתוח מרכזיות ועמידוּת ברשת התחבורה הציבורית בישראל כרשת מורכבת</w:t>
       </w:r>
     </w:p>
     <w:p>
       <w:pPr>
+        <w:spacing w:after="80"/>
+        <w:jc w:val="center"/>
         <w:pBdr>
-          <w:bottom w:val="single" w:sz="10" w:space="2" w:color="12314F"/>
+          <w:bottom w:val="single" w:sz="8" w:space="2" w:color="000000"/>
         </w:pBdr>
-        <w:spacing w:after="120"/>
       </w:pPr>
+    </w:p>
+    <w:p>
+      <w:pPr>
+        <w:bidi/>
+        <w:spacing w:before="1600" w:after="120"/>
+        <w:jc w:val="center"/>
+      </w:pPr>
+      <w:r>
+        <w:rPr>
+          <w:rFonts w:ascii="David" w:hAnsi="David" w:cs="David"/>
+          <w:b w:val="0"/>
+          <w:i w:val="0"/>
+          <w:color w:val="000000"/>
+          <w:sz w:val="24"/>
+          <w:szCs w:val="24"/>
+          <w:rtl w:val="1"/>
+        </w:rPr>
+        <w:t>מגישים: ‹שם מלא›, ‹שם מלא›, ‹שם מלא›</w:t>
+      </w:r>
+    </w:p>
+    <w:p>
+      <w:pPr>
+        <w:bidi/>
+        <w:spacing w:before="0" w:after="120"/>
+        <w:jc w:val="center"/>
+      </w:pPr>
+      <w:r>
+        <w:rPr>
+          <w:rFonts w:ascii="David" w:hAnsi="David" w:cs="David"/>
+          <w:b w:val="0"/>
+          <w:i w:val="0"/>
+          <w:color w:val="000000"/>
+          <w:sz w:val="24"/>
+          <w:szCs w:val="24"/>
+          <w:rtl w:val="1"/>
+        </w:rPr>
+        <w:t>מנחה: ד"ר אבנר פריאל</w:t>
+      </w:r>
+    </w:p>
+    <w:p>
+      <w:pPr>
+        <w:bidi/>
+        <w:spacing w:before="120" w:after="120"/>
+        <w:jc w:val="center"/>
+      </w:pPr>
+      <w:r>
+        <w:rPr>
+          <w:rFonts w:ascii="David" w:hAnsi="David" w:cs="David"/>
+          <w:b w:val="0"/>
+          <w:i w:val="0"/>
+          <w:color w:val="333333"/>
+          <w:sz w:val="22"/>
+          <w:szCs w:val="22"/>
+          <w:rtl w:val="1"/>
+        </w:rPr>
+        <w:t>מקור הנתונים: פיד ה-GTFS של משרד התחבורה (אפריל 2026)</w:t>
+      </w:r>
+    </w:p>
+    <w:p>
+      <w:pPr>
+        <w:bidi/>
+        <w:spacing w:before="520" w:after="120"/>
+        <w:jc w:val="center"/>
+      </w:pPr>
+      <w:r>
+        <w:rPr>
+          <w:rFonts w:ascii="David" w:hAnsi="David" w:cs="David"/>
+          <w:b w:val="0"/>
+          <w:i w:val="0"/>
+          <w:color w:val="000000"/>
+          <w:sz w:val="24"/>
+          <w:szCs w:val="24"/>
+          <w:rtl w:val="1"/>
+        </w:rPr>
+        <w:t>יולי 2026</w:t>
+      </w:r>
+    </w:p>
+    <w:p>
+      <w:r>
+        <w:br w:type="page"/>
+      </w:r>
     </w:p>
     <w:p>
       <w:pPr>
@@ -293,15 +379,15 @@
         <w:spacing w:before="240" w:after="80"/>
         <w:jc w:val="right"/>
         <w:pBdr>
-          <w:bottom w:val="single" w:sz="10" w:space="2" w:color="12314F"/>
+          <w:bottom w:val="single" w:sz="8" w:space="2" w:color="000000"/>
         </w:pBdr>
       </w:pPr>
       <w:r>
         <w:rPr>
-          <w:rFonts w:ascii="Arial" w:hAnsi="Arial" w:cs="Arial"/>
+          <w:rFonts w:ascii="David" w:hAnsi="David" w:cs="David"/>
           <w:b/>
           <w:i w:val="0"/>
-          <w:color w:val="12314F"/>
+          <w:color w:val="000000"/>
           <w:sz w:val="27"/>
           <w:szCs w:val="27"/>
           <w:rtl w:val="1"/>
@@ -377,15 +463,15 @@
         <w:spacing w:before="240" w:after="80"/>
         <w:jc w:val="right"/>
         <w:pBdr>
-          <w:bottom w:val="single" w:sz="10" w:space="2" w:color="12314F"/>
+          <w:bottom w:val="single" w:sz="8" w:space="2" w:color="000000"/>
         </w:pBdr>
       </w:pPr>
       <w:r>
         <w:rPr>
-          <w:rFonts w:ascii="Arial" w:hAnsi="Arial" w:cs="Arial"/>
+          <w:rFonts w:ascii="David" w:hAnsi="David" w:cs="David"/>
           <w:b/>
           <w:i w:val="0"/>
-          <w:color w:val="12314F"/>
+          <w:color w:val="000000"/>
           <w:sz w:val="27"/>
           <w:szCs w:val="27"/>
           <w:rtl w:val="1"/>
@@ -642,7 +728,7 @@
           <w:rFonts w:ascii="Arial" w:hAnsi="Arial" w:cs="Arial"/>
           <w:b/>
           <w:i w:val="0"/>
-          <w:color w:val="12314F"/>
+          <w:color w:val="000000"/>
           <w:sz w:val="20"/>
           <w:szCs w:val="20"/>
           <w:rtl w:val="1"/>
@@ -670,7 +756,7 @@
         <w:tc>
           <w:tcPr>
             <w:tcW w:type="dxa" w:w="1662"/>
-            <w:shd w:fill="12314F"/>
+            <w:shd w:fill="D9D9D9"/>
           </w:tcPr>
           <w:p>
             <w:pPr>
@@ -682,7 +768,7 @@
                 <w:rFonts w:ascii="David" w:hAnsi="David" w:cs="David"/>
                 <w:b/>
                 <w:i w:val="0"/>
-                <w:color w:val="FFFFFF"/>
+                <w:color w:val="000000"/>
                 <w:sz w:val="20"/>
                 <w:szCs w:val="20"/>
                 <w:rtl w:val="1"/>
@@ -694,7 +780,7 @@
         <w:tc>
           <w:tcPr>
             <w:tcW w:type="dxa" w:w="1662"/>
-            <w:shd w:fill="12314F"/>
+            <w:shd w:fill="D9D9D9"/>
           </w:tcPr>
           <w:p>
             <w:pPr>
@@ -706,7 +792,7 @@
                 <w:rFonts w:ascii="David" w:hAnsi="David" w:cs="David"/>
                 <w:b/>
                 <w:i w:val="0"/>
-                <w:color w:val="FFFFFF"/>
+                <w:color w:val="000000"/>
                 <w:sz w:val="20"/>
                 <w:szCs w:val="20"/>
                 <w:rtl w:val="1"/>
@@ -718,7 +804,7 @@
         <w:tc>
           <w:tcPr>
             <w:tcW w:type="dxa" w:w="1662"/>
-            <w:shd w:fill="12314F"/>
+            <w:shd w:fill="D9D9D9"/>
           </w:tcPr>
           <w:p>
             <w:pPr>
@@ -730,7 +816,7 @@
                 <w:rFonts w:ascii="David" w:hAnsi="David" w:cs="David"/>
                 <w:b/>
                 <w:i w:val="0"/>
-                <w:color w:val="FFFFFF"/>
+                <w:color w:val="000000"/>
                 <w:sz w:val="20"/>
                 <w:szCs w:val="20"/>
                 <w:rtl w:val="1"/>
@@ -742,7 +828,7 @@
         <w:tc>
           <w:tcPr>
             <w:tcW w:type="dxa" w:w="1662"/>
-            <w:shd w:fill="12314F"/>
+            <w:shd w:fill="D9D9D9"/>
           </w:tcPr>
           <w:p>
             <w:pPr>
@@ -754,7 +840,7 @@
                 <w:rFonts w:ascii="David" w:hAnsi="David" w:cs="David"/>
                 <w:b/>
                 <w:i w:val="0"/>
-                <w:color w:val="FFFFFF"/>
+                <w:color w:val="000000"/>
                 <w:sz w:val="20"/>
                 <w:szCs w:val="20"/>
                 <w:rtl w:val="1"/>
@@ -766,7 +852,7 @@
         <w:tc>
           <w:tcPr>
             <w:tcW w:type="dxa" w:w="1662"/>
-            <w:shd w:fill="12314F"/>
+            <w:shd w:fill="D9D9D9"/>
           </w:tcPr>
           <w:p>
             <w:pPr>
@@ -778,7 +864,7 @@
                 <w:rFonts w:ascii="David" w:hAnsi="David" w:cs="David"/>
                 <w:b/>
                 <w:i w:val="0"/>
-                <w:color w:val="FFFFFF"/>
+                <w:color w:val="000000"/>
                 <w:sz w:val="20"/>
                 <w:szCs w:val="20"/>
                 <w:rtl w:val="1"/>
@@ -790,7 +876,7 @@
         <w:tc>
           <w:tcPr>
             <w:tcW w:type="dxa" w:w="1662"/>
-            <w:shd w:fill="12314F"/>
+            <w:shd w:fill="D9D9D9"/>
           </w:tcPr>
           <w:p>
             <w:pPr>
@@ -802,7 +888,7 @@
                 <w:rFonts w:ascii="David" w:hAnsi="David" w:cs="David"/>
                 <w:b/>
                 <w:i w:val="0"/>
-                <w:color w:val="FFFFFF"/>
+                <w:color w:val="000000"/>
                 <w:sz w:val="20"/>
                 <w:szCs w:val="20"/>
                 <w:rtl w:val="1"/>
@@ -1226,15 +1312,15 @@
         <w:spacing w:before="240" w:after="80"/>
         <w:jc w:val="right"/>
         <w:pBdr>
-          <w:bottom w:val="single" w:sz="10" w:space="2" w:color="12314F"/>
+          <w:bottom w:val="single" w:sz="8" w:space="2" w:color="000000"/>
         </w:pBdr>
       </w:pPr>
       <w:r>
         <w:rPr>
-          <w:rFonts w:ascii="Arial" w:hAnsi="Arial" w:cs="Arial"/>
+          <w:rFonts w:ascii="David" w:hAnsi="David" w:cs="David"/>
           <w:b/>
           <w:i w:val="0"/>
-          <w:color w:val="12314F"/>
+          <w:color w:val="000000"/>
           <w:sz w:val="27"/>
           <w:szCs w:val="27"/>
           <w:rtl w:val="1"/>
@@ -1597,7 +1683,7 @@
           <w:rFonts w:ascii="David" w:hAnsi="David" w:cs="David"/>
           <w:b/>
           <w:i w:val="0"/>
-          <w:color w:val="12314F"/>
+          <w:color w:val="000000"/>
           <w:sz w:val="19"/>
           <w:szCs w:val="19"/>
           <w:rtl w:val="1"/>
@@ -1743,15 +1829,15 @@
         <w:spacing w:before="240" w:after="80"/>
         <w:jc w:val="right"/>
         <w:pBdr>
-          <w:bottom w:val="single" w:sz="10" w:space="2" w:color="12314F"/>
+          <w:bottom w:val="single" w:sz="8" w:space="2" w:color="000000"/>
         </w:pBdr>
       </w:pPr>
       <w:r>
         <w:rPr>
-          <w:rFonts w:ascii="Arial" w:hAnsi="Arial" w:cs="Arial"/>
+          <w:rFonts w:ascii="David" w:hAnsi="David" w:cs="David"/>
           <w:b/>
           <w:i w:val="0"/>
-          <w:color w:val="12314F"/>
+          <w:color w:val="000000"/>
           <w:sz w:val="27"/>
           <w:szCs w:val="27"/>
           <w:rtl w:val="1"/>
@@ -2070,7 +2156,7 @@
           <w:rFonts w:ascii="David" w:hAnsi="David" w:cs="David"/>
           <w:b/>
           <w:i w:val="0"/>
-          <w:color w:val="12314F"/>
+          <w:color w:val="000000"/>
           <w:sz w:val="19"/>
           <w:szCs w:val="19"/>
           <w:rtl w:val="1"/>
@@ -2189,7 +2275,7 @@
           <w:rFonts w:ascii="David" w:hAnsi="David" w:cs="David"/>
           <w:b/>
           <w:i w:val="0"/>
-          <w:color w:val="12314F"/>
+          <w:color w:val="000000"/>
           <w:sz w:val="19"/>
           <w:szCs w:val="19"/>
           <w:rtl w:val="1"/>
@@ -2308,7 +2394,7 @@
           <w:rFonts w:ascii="David" w:hAnsi="David" w:cs="David"/>
           <w:b/>
           <w:i w:val="0"/>
-          <w:color w:val="12314F"/>
+          <w:color w:val="000000"/>
           <w:sz w:val="19"/>
           <w:szCs w:val="19"/>
           <w:rtl w:val="1"/>
@@ -2382,15 +2468,15 @@
         <w:spacing w:before="240" w:after="80"/>
         <w:jc w:val="right"/>
         <w:pBdr>
-          <w:bottom w:val="single" w:sz="10" w:space="2" w:color="12314F"/>
+          <w:bottom w:val="single" w:sz="8" w:space="2" w:color="000000"/>
         </w:pBdr>
       </w:pPr>
       <w:r>
         <w:rPr>
-          <w:rFonts w:ascii="Arial" w:hAnsi="Arial" w:cs="Arial"/>
+          <w:rFonts w:ascii="David" w:hAnsi="David" w:cs="David"/>
           <w:b/>
           <w:i w:val="0"/>
-          <w:color w:val="12314F"/>
+          <w:color w:val="000000"/>
           <w:sz w:val="27"/>
           <w:szCs w:val="27"/>
           <w:rtl w:val="1"/>
@@ -2731,7 +2817,7 @@
           <w:rFonts w:ascii="David" w:hAnsi="David" w:cs="David"/>
           <w:b/>
           <w:i w:val="0"/>
-          <w:color w:val="12314F"/>
+          <w:color w:val="000000"/>
           <w:sz w:val="19"/>
           <w:szCs w:val="19"/>
           <w:rtl w:val="1"/>
@@ -2829,15 +2915,15 @@
         <w:spacing w:before="240" w:after="80"/>
         <w:jc w:val="right"/>
         <w:pBdr>
-          <w:bottom w:val="single" w:sz="10" w:space="2" w:color="12314F"/>
+          <w:bottom w:val="single" w:sz="8" w:space="2" w:color="000000"/>
         </w:pBdr>
       </w:pPr>
       <w:r>
         <w:rPr>
-          <w:rFonts w:ascii="Arial" w:hAnsi="Arial" w:cs="Arial"/>
+          <w:rFonts w:ascii="David" w:hAnsi="David" w:cs="David"/>
           <w:b/>
           <w:i w:val="0"/>
-          <w:color w:val="12314F"/>
+          <w:color w:val="000000"/>
           <w:sz w:val="27"/>
           <w:szCs w:val="27"/>
           <w:rtl w:val="1"/>
@@ -3222,7 +3308,7 @@
           <w:rFonts w:ascii="David" w:hAnsi="David" w:cs="David"/>
           <w:b/>
           <w:i w:val="0"/>
-          <w:color w:val="12314F"/>
+          <w:color w:val="000000"/>
           <w:sz w:val="19"/>
           <w:szCs w:val="19"/>
           <w:rtl w:val="1"/>
@@ -3320,15 +3406,15 @@
         <w:spacing w:before="240" w:after="80"/>
         <w:jc w:val="right"/>
         <w:pBdr>
-          <w:bottom w:val="single" w:sz="10" w:space="2" w:color="12314F"/>
+          <w:bottom w:val="single" w:sz="8" w:space="2" w:color="000000"/>
         </w:pBdr>
       </w:pPr>
       <w:r>
         <w:rPr>
-          <w:rFonts w:ascii="Arial" w:hAnsi="Arial" w:cs="Arial"/>
+          <w:rFonts w:ascii="David" w:hAnsi="David" w:cs="David"/>
           <w:b/>
           <w:i w:val="0"/>
-          <w:color w:val="12314F"/>
+          <w:color w:val="000000"/>
           <w:sz w:val="27"/>
           <w:szCs w:val="27"/>
           <w:rtl w:val="1"/>
@@ -3669,7 +3755,7 @@
           <w:rFonts w:ascii="David" w:hAnsi="David" w:cs="David"/>
           <w:b/>
           <w:i w:val="0"/>
-          <w:color w:val="12314F"/>
+          <w:color w:val="000000"/>
           <w:sz w:val="19"/>
           <w:szCs w:val="19"/>
           <w:rtl w:val="1"/>
@@ -3695,15 +3781,15 @@
         <w:spacing w:before="240" w:after="80"/>
         <w:jc w:val="right"/>
         <w:pBdr>
-          <w:bottom w:val="single" w:sz="10" w:space="2" w:color="12314F"/>
+          <w:bottom w:val="single" w:sz="8" w:space="2" w:color="000000"/>
         </w:pBdr>
       </w:pPr>
       <w:r>
         <w:rPr>
-          <w:rFonts w:ascii="Arial" w:hAnsi="Arial" w:cs="Arial"/>
+          <w:rFonts w:ascii="David" w:hAnsi="David" w:cs="David"/>
           <w:b/>
           <w:i w:val="0"/>
-          <w:color w:val="12314F"/>
+          <w:color w:val="000000"/>
           <w:sz w:val="27"/>
           <w:szCs w:val="27"/>
           <w:rtl w:val="1"/>
@@ -4132,7 +4218,7 @@
           <w:rFonts w:ascii="David" w:hAnsi="David" w:cs="David"/>
           <w:b/>
           <w:i w:val="0"/>
-          <w:color w:val="12314F"/>
+          <w:color w:val="000000"/>
           <w:sz w:val="19"/>
           <w:szCs w:val="19"/>
           <w:rtl w:val="1"/>
@@ -4251,7 +4337,7 @@
           <w:rFonts w:ascii="David" w:hAnsi="David" w:cs="David"/>
           <w:b/>
           <w:i w:val="0"/>
-          <w:color w:val="12314F"/>
+          <w:color w:val="000000"/>
           <w:sz w:val="19"/>
           <w:szCs w:val="19"/>
           <w:rtl w:val="1"/>
@@ -4349,15 +4435,15 @@
         <w:spacing w:before="240" w:after="80"/>
         <w:jc w:val="right"/>
         <w:pBdr>
-          <w:bottom w:val="single" w:sz="10" w:space="2" w:color="12314F"/>
+          <w:bottom w:val="single" w:sz="8" w:space="2" w:color="000000"/>
         </w:pBdr>
       </w:pPr>
       <w:r>
         <w:rPr>
-          <w:rFonts w:ascii="Arial" w:hAnsi="Arial" w:cs="Arial"/>
+          <w:rFonts w:ascii="David" w:hAnsi="David" w:cs="David"/>
           <w:b/>
           <w:i w:val="0"/>
-          <w:color w:val="12314F"/>
+          <w:color w:val="000000"/>
           <w:sz w:val="27"/>
           <w:szCs w:val="27"/>
           <w:rtl w:val="1"/>
@@ -4522,7 +4608,7 @@
           <w:rFonts w:ascii="David" w:hAnsi="David" w:cs="David"/>
           <w:b/>
           <w:i w:val="0"/>
-          <w:color w:val="12314F"/>
+          <w:color w:val="000000"/>
           <w:sz w:val="19"/>
           <w:szCs w:val="19"/>
           <w:rtl w:val="1"/>
@@ -4572,15 +4658,15 @@
         <w:spacing w:before="240" w:after="80"/>
         <w:jc w:val="right"/>
         <w:pBdr>
-          <w:bottom w:val="single" w:sz="10" w:space="2" w:color="12314F"/>
+          <w:bottom w:val="single" w:sz="8" w:space="2" w:color="000000"/>
         </w:pBdr>
       </w:pPr>
       <w:r>
         <w:rPr>
-          <w:rFonts w:ascii="Arial" w:hAnsi="Arial" w:cs="Arial"/>
+          <w:rFonts w:ascii="David" w:hAnsi="David" w:cs="David"/>
           <w:b/>
           <w:i w:val="0"/>
-          <w:color w:val="12314F"/>
+          <w:color w:val="000000"/>
           <w:sz w:val="27"/>
           <w:szCs w:val="27"/>
           <w:rtl w:val="1"/>
@@ -4999,7 +5085,7 @@
           <w:rFonts w:ascii="David" w:hAnsi="David" w:cs="David"/>
           <w:b w:val="0"/>
           <w:i w:val="0"/>
-          <w:color w:val="5A6B7D"/>
+          <w:color w:val="333333"/>
           <w:sz w:val="19"/>
           <w:szCs w:val="19"/>
           <w:rtl w:val="1"/>
@@ -5011,7 +5097,7 @@
           <w:rFonts w:ascii="David" w:hAnsi="David" w:cs="David"/>
           <w:b w:val="0"/>
           <w:i w:val="0"/>
-          <w:color w:val="5A6B7D"/>
+          <w:color w:val="333333"/>
           <w:sz w:val="19"/>
           <w:szCs w:val="19"/>
           <w:rtl w:val="1"/>
@@ -5023,7 +5109,7 @@
           <w:rFonts w:ascii="David" w:hAnsi="David" w:cs="David"/>
           <w:b w:val="0"/>
           <w:i w:val="0"/>
-          <w:color w:val="5A6B7D"/>
+          <w:color w:val="333333"/>
           <w:sz w:val="19"/>
           <w:szCs w:val="19"/>
           <w:rtl w:val="1"/>
@@ -5035,7 +5121,7 @@
           <w:rFonts w:ascii="David" w:hAnsi="David" w:cs="David"/>
           <w:b w:val="0"/>
           <w:i w:val="0"/>
-          <w:color w:val="5A6B7D"/>
+          <w:color w:val="333333"/>
           <w:sz w:val="19"/>
           <w:szCs w:val="19"/>
           <w:rtl w:val="1"/>

</xml_diff>

<commit_message>
Rename the report: "What is a critical station?"
Replace the flat descriptive title "Critical Stations" with a
thesis-style title framed around the actual claim - that criticality has
no single definition:

  מהי תחנה קריטית? מסגרת השוואתית לניתוח מרכזיות ועמידות ברשת התחבורה
  הציבורית בישראל

Applied across both PDF editions, the DOCX title page and the HTML
sources, and all three rebuilt.

Co-Authored-By: Claude Opus 4.8 (1M context) <noreply@anthropic.com>
</commit_message>
<xml_diff>
--- a/reports/final_report_he.docx
+++ b/reports/final_report_he.docx
@@ -56,7 +56,7 @@
           <w:szCs w:val="60"/>
           <w:rtl w:val="1"/>
         </w:rPr>
-        <w:t>תחנות קריטיות</w:t>
+        <w:t>מהי תחנה קריטית?</w:t>
       </w:r>
     </w:p>
     <w:p>
@@ -75,7 +75,7 @@
           <w:szCs w:val="28"/>
           <w:rtl w:val="1"/>
         </w:rPr>
-        <w:t>ניתוח מרכזיות ועמידוּת ברשת התחבורה הציבורית בישראל כרשת מורכבת</w:t>
+        <w:t>מסגרת השוואתית לניתוח מרכזיות ועמידוּת ברשת התחבורה הציבורית בישראל</w:t>
       </w:r>
     </w:p>
     <w:p>

</xml_diff>

<commit_message>
Rebuild the DOCX consistent with the sources (new title, new research question, no nikud)
The on-disk DOCX had drifted: placeholder names, the old research
question, and it was the target of the nikud cleanup. Rebuilt it fresh
from final_report_he.html so it matches the PDF - new title, reachability-
framed research question, no partial nikud. Title-page name/institution
fields are placeholders to fill in Word (as the last step).

Co-Authored-By: Claude Opus 4.8 (1M context) <noreply@anthropic.com>
</commit_message>
<xml_diff>
--- a/reports/final_report_he.docx
+++ b/reports/final_report_he.docx
@@ -75,7 +75,7 @@
           <w:szCs w:val="28"/>
           <w:rtl w:val="1"/>
         </w:rPr>
-        <w:t>מסגרת השוואתית לניתוח מרכזיות ועמידוּת ברשת התחבורה הציבורית בישראל</w:t>
+        <w:t>מסגרת השוואתית לניתוח מרכזיות ועמידות ברשת התחבורה הציבורית בישראל</w:t>
       </w:r>
     </w:p>
     <w:p>
@@ -271,7 +271,7 @@
           <w:szCs w:val="22"/>
           <w:rtl w:val="1"/>
         </w:rPr>
-        <w:t>אילו תחנות הן הקריטיות ביותר</w:t>
+        <w:t>אילו תחנות הן הקריטיות ביותר לשמירה על עמידות הרשת, כלומר על יכולתה להוסיף ולחבר בין מוצא ליעד</w:t>
       </w:r>
       <w:r>
         <w:rPr>
@@ -714,7 +714,7 @@
           <w:szCs w:val="24"/>
           <w:rtl w:val="1"/>
         </w:rPr>
-        <w:t>), הפרה זניחה אך מדוּוחת.</w:t>
+        <w:t>), הפרה זניחה אך מדווחת.</w:t>
       </w:r>
     </w:p>
     <w:p>
@@ -1541,7 +1541,7 @@
           <w:szCs w:val="24"/>
           <w:rtl w:val="1"/>
         </w:rPr>
-        <w:t xml:space="preserve">). ההצמדוּת לגאוגרפיה אף </w:t>
+        <w:t xml:space="preserve">). ההצמדות לגאוגרפיה אף </w:t>
       </w:r>
       <w:r>
         <w:rPr>
@@ -2025,7 +2025,7 @@
           <w:szCs w:val="24"/>
           <w:rtl w:val="1"/>
         </w:rPr>
-        <w:t>98.2% ברוֹת-החלפה</w:t>
+        <w:t>98.2% ברות-החלפה</w:t>
       </w:r>
       <w:r>
         <w:rPr>
@@ -2435,7 +2435,7 @@
           <w:szCs w:val="19"/>
           <w:rtl w:val="1"/>
         </w:rPr>
-        <w:t xml:space="preserve"> ברוֹת-החלפה) מגמדות את שלוש האדומות (</w:t>
+        <w:t xml:space="preserve"> ברות-החלפה) מגמדות את שלוש האדומות (</w:t>
       </w:r>
       <w:r>
         <w:rPr>
@@ -2481,7 +2481,7 @@
           <w:szCs w:val="27"/>
           <w:rtl w:val="1"/>
         </w:rPr>
-        <w:t>5. עמידוּת: חסינה-אך-שבירה</w:t>
+        <w:t>5. עמידות: חסינה-אך-שבירה</w:t>
       </w:r>
     </w:p>
     <w:p>
@@ -2565,7 +2565,7 @@
           <w:szCs w:val="24"/>
           <w:rtl w:val="1"/>
         </w:rPr>
-        <w:t xml:space="preserve"> (איור 5). מפתיע: התקיפה היעילה ביותר לחישוב, לפי דרגה, היא גם ההרסנית ביותר במצטבר. הפגיעוּת האזורית מלמדת ש"פגיעוּת" אינה מושג יחיד: הצפון מוביל בצווארי-בקבוק (</w:t>
+        <w:t xml:space="preserve"> (איור 5). מפתיע: התקיפה היעילה ביותר לחישוב, לפי דרגה, היא גם ההרסנית ביותר במצטבר. הפגיעות האזורית מלמדת ש"פגיעות" אינה מושג יחיד: הצפון מוביל בצווארי-בקבוק (</w:t>
       </w:r>
       <w:r>
         <w:rPr>
@@ -2609,7 +2609,7 @@
           <w:szCs w:val="24"/>
           <w:rtl w:val="1"/>
         </w:rPr>
-        <w:t xml:space="preserve"> חריגה במבנה עצי דל-יתירוּת (</w:t>
+        <w:t xml:space="preserve"> חריגה במבנה עצי דל-יתירות (</w:t>
       </w:r>
       <w:r>
         <w:rPr>
@@ -2928,7 +2928,7 @@
           <w:szCs w:val="27"/>
           <w:rtl w:val="1"/>
         </w:rPr>
-        <w:t>6. קהילות ושוויוניוּת: פרדוקס Simpson</w:t>
+        <w:t>6. קהילות ושוויוניות: פרדוקס Simpson</w:t>
       </w:r>
     </w:p>
     <w:p>
@@ -2968,7 +2968,7 @@
           <w:szCs w:val="24"/>
           <w:rtl w:val="1"/>
         </w:rPr>
-        <w:t xml:space="preserve"> קהילות עם מודולריוּת קיצונית (</w:t>
+        <w:t xml:space="preserve"> קהילות עם מודולריות קיצונית (</w:t>
       </w:r>
       <w:r>
         <w:rPr>
@@ -3254,7 +3254,7 @@
           <w:szCs w:val="24"/>
           <w:rtl w:val="1"/>
         </w:rPr>
-        <w:t>. שוויוניוּת התחבורה היא תכונה מקומית ותלוית-מדד, לא ארצית.</w:t>
+        <w:t>. שוויוניות התחבורה היא תכונה מקומית ותלוית-מדד, לא ארצית.</w:t>
       </w:r>
     </w:p>
     <w:p>
@@ -3437,7 +3437,7 @@
           <w:szCs w:val="24"/>
           <w:rtl w:val="1"/>
         </w:rPr>
-        <w:t xml:space="preserve">הרשת הארצית מסתירה שונוּת מבנית עצומה. האוטובוס מהווה </w:t>
+        <w:t xml:space="preserve">הרשת הארצית מסתירה שונות מבנית עצומה. האוטובוס מהווה </w:t>
       </w:r>
       <w:r>
         <w:rPr>
@@ -3525,7 +3525,7 @@
           <w:szCs w:val="24"/>
           <w:rtl w:val="1"/>
         </w:rPr>
-        <w:t xml:space="preserve"> — טופולוגיית מסלול חסרת-יתירוּת שבה כל מקטע הוא נקודת-כשל. גם "צומת מעבר רב-אופני" תלוי-מדד: לפי הגדרת ה-GTFS המחמירה (</w:t>
+        <w:t xml:space="preserve"> — טופולוגיית מסלול חסרת-יתירות שבה כל מקטע הוא נקודת-כשל. גם "צומת מעבר רב-אופני" תלוי-מדד: לפי הגדרת ה-GTFS המחמירה (</w:t>
       </w:r>
       <w:r>
         <w:rPr>
@@ -3772,7 +3772,7 @@
           <w:szCs w:val="19"/>
           <w:rtl w:val="1"/>
         </w:rPr>
-        <w:t xml:space="preserve"> גרף תלות-הדדית בין מודים (משקל הקשת = מספר התחנות המשותפות). בהגדרה המחמירה (משמאל) קשת אחת בלבד; בהגדרת ההליכתיוּת (מימין) האוטובוס משמש מרכז לרשת-כוכב. מעבר רב-אופני הוא תופעה של קרבה מרחבית, לא של רציף משותף.</w:t>
+        <w:t xml:space="preserve"> גרף תלות-הדדית בין מודים (משקל הקשת = מספר התחנות המשותפות). בהגדרה המחמירה (משמאל) קשת אחת בלבד; בהגדרת ההליכתיות (מימין) האוטובוס משמש מרכז לרשת-כוכב. מעבר רב-אופני הוא תופעה של קרבה מרחבית, לא של רציף משותף.</w:t>
       </w:r>
     </w:p>
     <w:p>
@@ -4164,7 +4164,7 @@
           <w:szCs w:val="24"/>
           <w:rtl w:val="1"/>
         </w:rPr>
-        <w:t xml:space="preserve"> (איור 9). ההטמעות מודדות את קלוּת ה-negatives, לא מבנה נלמד — תוצאה שלילית מבוקרת.</w:t>
+        <w:t xml:space="preserve"> (איור 9). ההטמעות מודדות את קלות ה-negatives, לא מבנה נלמד — תוצאה שלילית מבוקרת.</w:t>
       </w:r>
     </w:p>
     <w:p>
@@ -4426,7 +4426,7 @@
           <w:szCs w:val="19"/>
           <w:rtl w:val="1"/>
         </w:rPr>
-        <w:t>. ה-AUC ה"מרשים" נבע מקלוּת ה-negatives.</w:t>
+        <w:t>. ה-AUC ה"מרשים" נבע מקלות ה-negatives.</w:t>
       </w:r>
     </w:p>
     <w:p>
@@ -4510,7 +4510,7 @@
           <w:szCs w:val="24"/>
           <w:rtl w:val="1"/>
         </w:rPr>
-        <w:t xml:space="preserve"> בלבד (איור 10): הגדרות השבירוּת המבנית מציגות מתאם אפסי-עד-שלילי מול הגדרת העומס, בעוד betweenness, ביקוש ושעת-שיא מתלכדות. מתוך </w:t>
+        <w:t xml:space="preserve"> בלבד (איור 10): הגדרות השבירות המבנית מציגות מתאם אפסי-עד-שלילי מול הגדרת העומס, בעוד betweenness, ביקוש ושעת-שיא מתלכדות. מתוך </w:t>
       </w:r>
       <w:r>
         <w:rPr>
@@ -4649,7 +4649,7 @@
           <w:szCs w:val="19"/>
           <w:rtl w:val="1"/>
         </w:rPr>
-        <w:t xml:space="preserve"> בלבד; הגדרות השבירוּת המבנית מול הגדרת העומס באפס-עד-שלילי, בעוד betweenness/ביקוש/שעת-שיא מתלכדות — הממצא המרכזי.</w:t>
+        <w:t xml:space="preserve"> בלבד; הגדרות השבירות המבנית מול הגדרת העומס באפס-עד-שלילי, בעוד betweenness/ביקוש/שעת-שיא מתלכדות — הממצא המרכזי.</w:t>
       </w:r>
     </w:p>
     <w:p>
@@ -4882,7 +4882,7 @@
           <w:szCs w:val="24"/>
           <w:rtl w:val="1"/>
         </w:rPr>
-        <w:t xml:space="preserve"> ופגיעוּת עצמה מתפצלת — הצפון מוביל בצווארי-בקבוק, ירושלים במבנה עצי דל-יתירוּת.</w:t>
+        <w:t xml:space="preserve"> ופגיעות עצמה מתפצלת — הצפון מוביל בצווארי-בקבוק, ירושלים במבנה עצי דל-יתירות.</w:t>
       </w:r>
     </w:p>
     <w:p>
@@ -4912,7 +4912,7 @@
           <w:szCs w:val="24"/>
           <w:rtl w:val="1"/>
         </w:rPr>
-        <w:t>שוויוניוּת מקומית ותלוית-מדד:</w:t>
+        <w:t>שוויוניות מקומית ותלוית-מדד:</w:t>
       </w:r>
       <w:r>
         <w:rPr>
@@ -5008,7 +5008,7 @@
           <w:szCs w:val="24"/>
           <w:rtl w:val="1"/>
         </w:rPr>
-        <w:t xml:space="preserve"> אך המודים הקטנים חסרי-יתירוּת והמעבר הרב-אופני נסתר במודל הנתונים.</w:t>
+        <w:t xml:space="preserve"> אך המודים הקטנים חסרי-יתירות והמעבר הרב-אופני נסתר במודל הנתונים.</w:t>
       </w:r>
     </w:p>
     <w:p>
@@ -5090,7 +5090,7 @@
           <w:szCs w:val="19"/>
           <w:rtl w:val="1"/>
         </w:rPr>
-        <w:t xml:space="preserve">מגבלות: משקלים סופרים שירות מתוכנן ולא ביקוש; betweenness מקורב; תחליפיוּת מרחבית בלבד; תמונת-מצב של חודש אחד. פירוט מלא של הניתוחים והרחבות עתידיות במחברות </w:t>
+        <w:t xml:space="preserve">מגבלות: משקלים סופרים שירות מתוכנן ולא ביקוש; betweenness מקורב; תחליפיות מרחבית בלבד; תמונת-מצב של חודש אחד. פירוט מלא של הניתוחים והרחבות עתידיות במחברות </w:t>
       </w:r>
       <w:r>
         <w:rPr>

</xml_diff>